<commit_message>
Update Arc Mechanism section to reflect full 30-day dataset
Replace the 12-day small-subset table with the complete 30-day arc
structure (6 arcs × 5 days each). Update section 3.2 from a "two-day
pattern" to the actual "five-day pattern" with day-by-day breakdown
table covering all 30 sessions. Fix remaining references to the small
dataset throughout the report.

https://claude.ai/code/session_01J3cXc7pW87mgWzwSoUYuaa
</commit_message>
<xml_diff>
--- a/docs/MetaClaw-Bench_Design_Analysis.docx
+++ b/docs/MetaClaw-Bench_Design_Analysis.docx
@@ -341,7 +341,7 @@
           <w:b w:val="0"/>
           <w:i w:val="0"/>
         </w:rPr>
-        <w:t>Each day in all_tests.json carries two fields: arc (letter A–F) and preference_tags (list of active rules). Together they define the cumulative difficulty curve:</w:t>
+        <w:t>Each day in all_tests.json carries two fields: arc (letter A–F) and preference_tags (list of active rules). Together they define the cumulative difficulty curve across 30 days. The full MetaClaw-bench dataset contains six arcs of five days each, giving a total of 30 independent evaluation sessions:</w:t>
       </w:r>
     </w:p>
     <w:p/>
@@ -375,7 +375,7 @@
         </w:tc>
         <w:tc>
           <w:tcPr>
-            <w:tcW w:type="dxa" w:w="1872"/>
+            <w:tcW w:type="dxa" w:w="1728"/>
             <w:shd w:val="clear" w:color="auto" w:fill="D9E1F2"/>
           </w:tcPr>
           <w:p>
@@ -383,13 +383,13 @@
               <w:rPr>
                 <w:b/>
               </w:rPr>
-              <w:t>Days (small)</w:t>
+              <w:t>Days</w:t>
             </w:r>
           </w:p>
         </w:tc>
         <w:tc>
           <w:tcPr>
-            <w:tcW w:type="dxa" w:w="2304"/>
+            <w:tcW w:type="dxa" w:w="2448"/>
             <w:shd w:val="clear" w:color="auto" w:fill="D9E1F2"/>
           </w:tcPr>
           <w:p>
@@ -429,17 +429,17 @@
         </w:tc>
         <w:tc>
           <w:tcPr>
-            <w:tcW w:type="dxa" w:w="1872"/>
+            <w:tcW w:type="dxa" w:w="1728"/>
           </w:tcPr>
           <w:p>
             <w:r>
-              <w:t>Day 01–02</w:t>
+              <w:t>Day 01–05</w:t>
             </w:r>
           </w:p>
         </w:tc>
         <w:tc>
           <w:tcPr>
-            <w:tcW w:type="dxa" w:w="2304"/>
+            <w:tcW w:type="dxa" w:w="2448"/>
           </w:tcPr>
           <w:p>
             <w:r>
@@ -453,7 +453,7 @@
           </w:tcPr>
           <w:p>
             <w:r>
-              <w:t>Introduce P1; cross-domain transfer test</w:t>
+              <w:t>Introduce P1 (ISO 8601); five-domain cross-transfer generalization</w:t>
             </w:r>
           </w:p>
         </w:tc>
@@ -471,17 +471,17 @@
         </w:tc>
         <w:tc>
           <w:tcPr>
-            <w:tcW w:type="dxa" w:w="1872"/>
+            <w:tcW w:type="dxa" w:w="1728"/>
           </w:tcPr>
           <w:p>
             <w:r>
-              <w:t>Day 03–04</w:t>
+              <w:t>Day 06–10</w:t>
             </w:r>
           </w:p>
         </w:tc>
         <w:tc>
           <w:tcPr>
-            <w:tcW w:type="dxa" w:w="2304"/>
+            <w:tcW w:type="dxa" w:w="2448"/>
           </w:tcPr>
           <w:p>
             <w:r>
@@ -495,7 +495,7 @@
           </w:tcPr>
           <w:p>
             <w:r>
-              <w:t>Introduce P2; joint P1+P2 validation</w:t>
+              <w:t>Introduce P2 (file naming); joint P1+P2 validation across domains</w:t>
             </w:r>
           </w:p>
         </w:tc>
@@ -513,17 +513,17 @@
         </w:tc>
         <w:tc>
           <w:tcPr>
-            <w:tcW w:type="dxa" w:w="1872"/>
+            <w:tcW w:type="dxa" w:w="1728"/>
           </w:tcPr>
           <w:p>
             <w:r>
-              <w:t>Day 05–06</w:t>
+              <w:t>Day 11–15</w:t>
             </w:r>
           </w:p>
         </w:tc>
         <w:tc>
           <w:tcPr>
-            <w:tcW w:type="dxa" w:w="2304"/>
+            <w:tcW w:type="dxa" w:w="2448"/>
           </w:tcPr>
           <w:p>
             <w:r>
@@ -537,7 +537,7 @@
           </w:tcPr>
           <w:p>
             <w:r>
-              <w:t>Introduce P3; three-rule comprehensive</w:t>
+              <w:t>Introduce P3 (metadata); three file-type variants (MD, JSON, Python)</w:t>
             </w:r>
           </w:p>
         </w:tc>
@@ -555,17 +555,17 @@
         </w:tc>
         <w:tc>
           <w:tcPr>
-            <w:tcW w:type="dxa" w:w="1872"/>
+            <w:tcW w:type="dxa" w:w="1728"/>
           </w:tcPr>
           <w:p>
             <w:r>
-              <w:t>Day 07–08</w:t>
+              <w:t>Day 16–20</w:t>
             </w:r>
           </w:p>
         </w:tc>
         <w:tc>
           <w:tcPr>
-            <w:tcW w:type="dxa" w:w="2304"/>
+            <w:tcW w:type="dxa" w:w="2448"/>
           </w:tcPr>
           <w:p>
             <w:r>
@@ -579,7 +579,7 @@
           </w:tcPr>
           <w:p>
             <w:r>
-              <w:t>Introduce P4; four-rule comprehensive</w:t>
+              <w:t>Introduce P4 (backup discipline); four-rule synthesis</w:t>
             </w:r>
           </w:p>
         </w:tc>
@@ -597,17 +597,17 @@
         </w:tc>
         <w:tc>
           <w:tcPr>
-            <w:tcW w:type="dxa" w:w="1872"/>
+            <w:tcW w:type="dxa" w:w="1728"/>
           </w:tcPr>
           <w:p>
             <w:r>
-              <w:t>Day 09–10</w:t>
+              <w:t>Day 21–25</w:t>
             </w:r>
           </w:p>
         </w:tc>
         <w:tc>
           <w:tcPr>
-            <w:tcW w:type="dxa" w:w="2304"/>
+            <w:tcW w:type="dxa" w:w="2448"/>
           </w:tcPr>
           <w:p>
             <w:r>
@@ -621,7 +621,7 @@
           </w:tcPr>
           <w:p>
             <w:r>
-              <w:t>Introduce P5; full five-rule test</w:t>
+              <w:t>Introduce P5 (done.log); full five-rule combined test</w:t>
             </w:r>
           </w:p>
         </w:tc>
@@ -639,17 +639,17 @@
         </w:tc>
         <w:tc>
           <w:tcPr>
-            <w:tcW w:type="dxa" w:w="1872"/>
+            <w:tcW w:type="dxa" w:w="1728"/>
           </w:tcPr>
           <w:p>
             <w:r>
-              <w:t>Day 11–12</w:t>
+              <w:t>Day 26–30</w:t>
             </w:r>
           </w:p>
         </w:tc>
         <w:tc>
           <w:tcPr>
-            <w:tcW w:type="dxa" w:w="2304"/>
+            <w:tcW w:type="dxa" w:w="2448"/>
           </w:tcPr>
           <w:p>
             <w:r>
@@ -663,7 +663,7 @@
           </w:tcPr>
           <w:p>
             <w:r>
-              <w:t>Zero-hint final exam; hardest scenarios</w:t>
+              <w:t>Zero-hint final exam; hardest tasks across all domains</w:t>
             </w:r>
           </w:p>
         </w:tc>
@@ -676,7 +676,7 @@
         <w:jc w:val="left"/>
       </w:pPr>
       <w:r>
-        <w:t>3.2  The Two-Day Pattern Inside Each Arc</w:t>
+        <w:t>3.2  The Five-Day Pattern Inside Each Arc</w:t>
       </w:r>
     </w:p>
     <w:p>
@@ -685,7 +685,7 @@
           <w:b w:val="0"/>
           <w:i w:val="0"/>
         </w:rPr>
-        <w:t>Every arc follows a consistent two-day pattern:</w:t>
+        <w:t>Every arc follows a consistent five-day internal progression. Each arc introduces one new preference and then consolidates it across four additional days of increasing complexity:</w:t>
       </w:r>
     </w:p>
     <w:p>
@@ -694,7 +694,7 @@
         <w:ind w:left="360"/>
       </w:pPr>
       <w:r>
-        <w:t>Day N  (arc opening) — "First Encounter": A new rule is introduced implicitly. The task does not mention the rule. The agent fails and receives corrective feedback that reveals the rule for the first time.</w:t>
+        <w:t>Day 1 of arc — "First Encounter": A new rule is introduced implicitly. The task does not mention the rule. The agent fails and receives corrective feedback that reveals the rule for the first time.</w:t>
       </w:r>
     </w:p>
     <w:p>
@@ -703,9 +703,1378 @@
         <w:ind w:left="360"/>
       </w:pPr>
       <w:r>
-        <w:t>Day N+1 (arc closing) — "Comprehensive Test": The same domain or a different domain is used, but now the agent is expected to follow all rules introduced so far without any hints.</w:t>
+        <w:t>Day 2 of arc — "Consolidation": The new rule is tested in a different domain or file type. Feedback still references the rule if violated, but no longer explains it from scratch.</w:t>
       </w:r>
     </w:p>
+    <w:p>
+      <w:pPr>
+        <w:pStyle w:val="ListBullet"/>
+        <w:ind w:left="360"/>
+      </w:pPr>
+      <w:r>
+        <w:t>Day 3 of arc — "Cross-Domain Transfer": The new rule is applied in a third domain (e.g., code engineering, data processing). Confirms transfer beyond the introduction context.</w:t>
+      </w:r>
+    </w:p>
+    <w:p>
+      <w:pPr>
+        <w:pStyle w:val="ListBullet"/>
+        <w:ind w:left="360"/>
+      </w:pPr>
+      <w:r>
+        <w:t>Day 4 of arc — "Combined Validation": All rules active so far are tested simultaneously in a project-management or multi-file scenario.</w:t>
+      </w:r>
+    </w:p>
+    <w:p>
+      <w:pPr>
+        <w:pStyle w:val="ListBullet"/>
+        <w:ind w:left="360"/>
+      </w:pPr>
+      <w:r>
+        <w:t>Day 5 of arc — "Full Generalization": Sprint wrap-up or comprehensive review scenario. Agent must apply all rules correctly with minimal hints. Feeds directly into Arc F's zero-hint baseline.</w:t>
+      </w:r>
+    </w:p>
+    <w:p>
+      <w:r>
+        <w:rPr>
+          <w:b/>
+          <w:i w:val="0"/>
+        </w:rPr>
+        <w:t>Arc-by-arc breakdown:</w:t>
+      </w:r>
+    </w:p>
+    <w:tbl>
+      <w:tblPr>
+        <w:tblStyle w:val="TableGrid"/>
+        <w:tblW w:type="auto" w:w="0"/>
+        <w:jc w:val="left"/>
+        <w:tblLook w:firstColumn="1" w:firstRow="1" w:lastColumn="0" w:lastRow="0" w:noHBand="0" w:noVBand="1" w:val="04A0"/>
+      </w:tblPr>
+      <w:tblGrid>
+        <w:gridCol w:w="2280"/>
+        <w:gridCol w:w="2280"/>
+        <w:gridCol w:w="2280"/>
+        <w:gridCol w:w="2280"/>
+      </w:tblGrid>
+      <w:tr>
+        <w:tc>
+          <w:tcPr>
+            <w:tcW w:type="dxa" w:w="648"/>
+            <w:shd w:val="clear" w:color="auto" w:fill="D9E1F2"/>
+          </w:tcPr>
+          <w:p>
+            <w:r>
+              <w:rPr>
+                <w:b/>
+              </w:rPr>
+              <w:t>Day</w:t>
+            </w:r>
+          </w:p>
+        </w:tc>
+        <w:tc>
+          <w:tcPr>
+            <w:tcW w:type="dxa" w:w="648"/>
+            <w:shd w:val="clear" w:color="auto" w:fill="D9E1F2"/>
+          </w:tcPr>
+          <w:p>
+            <w:r>
+              <w:rPr>
+                <w:b/>
+              </w:rPr>
+              <w:t>Arc</w:t>
+            </w:r>
+          </w:p>
+        </w:tc>
+        <w:tc>
+          <w:tcPr>
+            <w:tcW w:type="dxa" w:w="4608"/>
+            <w:shd w:val="clear" w:color="auto" w:fill="D9E1F2"/>
+          </w:tcPr>
+          <w:p>
+            <w:r>
+              <w:rPr>
+                <w:b/>
+              </w:rPr>
+              <w:t>Scenario Description</w:t>
+            </w:r>
+          </w:p>
+        </w:tc>
+        <w:tc>
+          <w:tcPr>
+            <w:tcW w:type="dxa" w:w="3024"/>
+            <w:shd w:val="clear" w:color="auto" w:fill="D9E1F2"/>
+          </w:tcPr>
+          <w:p>
+            <w:r>
+              <w:rPr>
+                <w:b/>
+              </w:rPr>
+              <w:t>Focus</w:t>
+            </w:r>
+          </w:p>
+        </w:tc>
+      </w:tr>
+      <w:tr>
+        <w:tc>
+          <w:tcPr>
+            <w:tcW w:type="dxa" w:w="648"/>
+          </w:tcPr>
+          <w:p>
+            <w:r>
+              <w:t>01</w:t>
+            </w:r>
+          </w:p>
+        </w:tc>
+        <w:tc>
+          <w:tcPr>
+            <w:tcW w:type="dxa" w:w="648"/>
+          </w:tcPr>
+          <w:p>
+            <w:r>
+              <w:t>A</w:t>
+            </w:r>
+          </w:p>
+        </w:tc>
+        <w:tc>
+          <w:tcPr>
+            <w:tcW w:type="dxa" w:w="4608"/>
+          </w:tcPr>
+          <w:p>
+            <w:r>
+              <w:t>Sprint 7 start — standup notes organization</w:t>
+            </w:r>
+          </w:p>
+        </w:tc>
+        <w:tc>
+          <w:tcPr>
+            <w:tcW w:type="dxa" w:w="3024"/>
+          </w:tcPr>
+          <w:p>
+            <w:r>
+              <w:t>P1 first introduction</w:t>
+            </w:r>
+          </w:p>
+        </w:tc>
+      </w:tr>
+      <w:tr>
+        <w:tc>
+          <w:tcPr>
+            <w:tcW w:type="dxa" w:w="648"/>
+          </w:tcPr>
+          <w:p>
+            <w:r>
+              <w:t>02</w:t>
+            </w:r>
+          </w:p>
+        </w:tc>
+        <w:tc>
+          <w:tcPr>
+            <w:tcW w:type="dxa" w:w="648"/>
+          </w:tcPr>
+          <w:p>
+            <w:r>
+              <w:t>A</w:t>
+            </w:r>
+          </w:p>
+        </w:tc>
+        <w:tc>
+          <w:tcPr>
+            <w:tcW w:type="dxa" w:w="4608"/>
+          </w:tcPr>
+          <w:p>
+            <w:r>
+              <w:t>Sprint 7 milestone updates and progress report</w:t>
+            </w:r>
+          </w:p>
+        </w:tc>
+        <w:tc>
+          <w:tcPr>
+            <w:tcW w:type="dxa" w:w="3024"/>
+          </w:tcPr>
+          <w:p>
+            <w:r>
+              <w:t>P1 consolidation</w:t>
+            </w:r>
+          </w:p>
+        </w:tc>
+      </w:tr>
+      <w:tr>
+        <w:tc>
+          <w:tcPr>
+            <w:tcW w:type="dxa" w:w="648"/>
+          </w:tcPr>
+          <w:p>
+            <w:r>
+              <w:t>03</w:t>
+            </w:r>
+          </w:p>
+        </w:tc>
+        <w:tc>
+          <w:tcPr>
+            <w:tcW w:type="dxa" w:w="648"/>
+          </w:tcPr>
+          <w:p>
+            <w:r>
+              <w:t>A</w:t>
+            </w:r>
+          </w:p>
+        </w:tc>
+        <w:tc>
+          <w:tcPr>
+            <w:tcW w:type="dxa" w:w="4608"/>
+          </w:tcPr>
+          <w:p>
+            <w:r>
+              <w:t>API log analysis and data consolidation</w:t>
+            </w:r>
+          </w:p>
+        </w:tc>
+        <w:tc>
+          <w:tcPr>
+            <w:tcW w:type="dxa" w:w="3024"/>
+          </w:tcPr>
+          <w:p>
+            <w:r>
+              <w:t>P1 cross-domain transfer</w:t>
+            </w:r>
+          </w:p>
+        </w:tc>
+      </w:tr>
+      <w:tr>
+        <w:tc>
+          <w:tcPr>
+            <w:tcW w:type="dxa" w:w="648"/>
+          </w:tcPr>
+          <w:p>
+            <w:r>
+              <w:t>04</w:t>
+            </w:r>
+          </w:p>
+        </w:tc>
+        <w:tc>
+          <w:tcPr>
+            <w:tcW w:type="dxa" w:w="648"/>
+          </w:tcPr>
+          <w:p>
+            <w:r>
+              <w:t>A</w:t>
+            </w:r>
+          </w:p>
+        </w:tc>
+        <w:tc>
+          <w:tcPr>
+            <w:tcW w:type="dxa" w:w="4608"/>
+          </w:tcPr>
+          <w:p>
+            <w:r>
+              <w:t>API documentation and code engineering</w:t>
+            </w:r>
+          </w:p>
+        </w:tc>
+        <w:tc>
+          <w:tcPr>
+            <w:tcW w:type="dxa" w:w="3024"/>
+          </w:tcPr>
+          <w:p>
+            <w:r>
+              <w:t>P1 in code context</w:t>
+            </w:r>
+          </w:p>
+        </w:tc>
+      </w:tr>
+      <w:tr>
+        <w:tc>
+          <w:tcPr>
+            <w:tcW w:type="dxa" w:w="648"/>
+          </w:tcPr>
+          <w:p>
+            <w:r>
+              <w:t>05</w:t>
+            </w:r>
+          </w:p>
+        </w:tc>
+        <w:tc>
+          <w:tcPr>
+            <w:tcW w:type="dxa" w:w="648"/>
+          </w:tcPr>
+          <w:p>
+            <w:r>
+              <w:t>A</w:t>
+            </w:r>
+          </w:p>
+        </w:tc>
+        <w:tc>
+          <w:tcPr>
+            <w:tcW w:type="dxa" w:w="4608"/>
+          </w:tcPr>
+          <w:p>
+            <w:r>
+              <w:t>Sprint 7 wrap-up and comprehensive review</w:t>
+            </w:r>
+          </w:p>
+        </w:tc>
+        <w:tc>
+          <w:tcPr>
+            <w:tcW w:type="dxa" w:w="3024"/>
+          </w:tcPr>
+          <w:p>
+            <w:r>
+              <w:t>P1 full generalization</w:t>
+            </w:r>
+          </w:p>
+        </w:tc>
+      </w:tr>
+      <w:tr>
+        <w:tc>
+          <w:tcPr>
+            <w:tcW w:type="dxa" w:w="648"/>
+          </w:tcPr>
+          <w:p>
+            <w:r>
+              <w:t>06</w:t>
+            </w:r>
+          </w:p>
+        </w:tc>
+        <w:tc>
+          <w:tcPr>
+            <w:tcW w:type="dxa" w:w="648"/>
+          </w:tcPr>
+          <w:p>
+            <w:r>
+              <w:t>B</w:t>
+            </w:r>
+          </w:p>
+        </w:tc>
+        <w:tc>
+          <w:tcPr>
+            <w:tcW w:type="dxa" w:w="4608"/>
+          </w:tcPr>
+          <w:p>
+            <w:r>
+              <w:t>Sprint 8 start — code engineering tasks</w:t>
+            </w:r>
+          </w:p>
+        </w:tc>
+        <w:tc>
+          <w:tcPr>
+            <w:tcW w:type="dxa" w:w="3024"/>
+          </w:tcPr>
+          <w:p>
+            <w:r>
+              <w:t>P2 first introduction</w:t>
+            </w:r>
+          </w:p>
+        </w:tc>
+      </w:tr>
+      <w:tr>
+        <w:tc>
+          <w:tcPr>
+            <w:tcW w:type="dxa" w:w="648"/>
+          </w:tcPr>
+          <w:p>
+            <w:r>
+              <w:t>07</w:t>
+            </w:r>
+          </w:p>
+        </w:tc>
+        <w:tc>
+          <w:tcPr>
+            <w:tcW w:type="dxa" w:w="648"/>
+          </w:tcPr>
+          <w:p>
+            <w:r>
+              <w:t>B</w:t>
+            </w:r>
+          </w:p>
+        </w:tc>
+        <w:tc>
+          <w:tcPr>
+            <w:tcW w:type="dxa" w:w="4608"/>
+          </w:tcPr>
+          <w:p>
+            <w:r>
+              <w:t>Documentation writing tasks</w:t>
+            </w:r>
+          </w:p>
+        </w:tc>
+        <w:tc>
+          <w:tcPr>
+            <w:tcW w:type="dxa" w:w="3024"/>
+          </w:tcPr>
+          <w:p>
+            <w:r>
+              <w:t>P2 consolidation</w:t>
+            </w:r>
+          </w:p>
+        </w:tc>
+      </w:tr>
+      <w:tr>
+        <w:tc>
+          <w:tcPr>
+            <w:tcW w:type="dxa" w:w="648"/>
+          </w:tcPr>
+          <w:p>
+            <w:r>
+              <w:t>08</w:t>
+            </w:r>
+          </w:p>
+        </w:tc>
+        <w:tc>
+          <w:tcPr>
+            <w:tcW w:type="dxa" w:w="648"/>
+          </w:tcPr>
+          <w:p>
+            <w:r>
+              <w:t>B</w:t>
+            </w:r>
+          </w:p>
+        </w:tc>
+        <w:tc>
+          <w:tcPr>
+            <w:tcW w:type="dxa" w:w="4608"/>
+          </w:tcPr>
+          <w:p>
+            <w:r>
+              <w:t>Data processing tasks</w:t>
+            </w:r>
+          </w:p>
+        </w:tc>
+        <w:tc>
+          <w:tcPr>
+            <w:tcW w:type="dxa" w:w="3024"/>
+          </w:tcPr>
+          <w:p>
+            <w:r>
+              <w:t>P2 cross-domain transfer</w:t>
+            </w:r>
+          </w:p>
+        </w:tc>
+      </w:tr>
+      <w:tr>
+        <w:tc>
+          <w:tcPr>
+            <w:tcW w:type="dxa" w:w="648"/>
+          </w:tcPr>
+          <w:p>
+            <w:r>
+              <w:t>09</w:t>
+            </w:r>
+          </w:p>
+        </w:tc>
+        <w:tc>
+          <w:tcPr>
+            <w:tcW w:type="dxa" w:w="648"/>
+          </w:tcPr>
+          <w:p>
+            <w:r>
+              <w:t>B</w:t>
+            </w:r>
+          </w:p>
+        </w:tc>
+        <w:tc>
+          <w:tcPr>
+            <w:tcW w:type="dxa" w:w="4608"/>
+          </w:tcPr>
+          <w:p>
+            <w:r>
+              <w:t>Project management tasks</w:t>
+            </w:r>
+          </w:p>
+        </w:tc>
+        <w:tc>
+          <w:tcPr>
+            <w:tcW w:type="dxa" w:w="3024"/>
+          </w:tcPr>
+          <w:p>
+            <w:r>
+              <w:t>P1 + P2 combined test</w:t>
+            </w:r>
+          </w:p>
+        </w:tc>
+      </w:tr>
+      <w:tr>
+        <w:tc>
+          <w:tcPr>
+            <w:tcW w:type="dxa" w:w="648"/>
+          </w:tcPr>
+          <w:p>
+            <w:r>
+              <w:t>10</w:t>
+            </w:r>
+          </w:p>
+        </w:tc>
+        <w:tc>
+          <w:tcPr>
+            <w:tcW w:type="dxa" w:w="648"/>
+          </w:tcPr>
+          <w:p>
+            <w:r>
+              <w:t>B</w:t>
+            </w:r>
+          </w:p>
+        </w:tc>
+        <w:tc>
+          <w:tcPr>
+            <w:tcW w:type="dxa" w:w="4608"/>
+          </w:tcPr>
+          <w:p>
+            <w:r>
+              <w:t>Sprint 8 Week 1 wrap-up, comprehensive review</w:t>
+            </w:r>
+          </w:p>
+        </w:tc>
+        <w:tc>
+          <w:tcPr>
+            <w:tcW w:type="dxa" w:w="3024"/>
+          </w:tcPr>
+          <w:p>
+            <w:r>
+              <w:t>P1 + P2 full generalization</w:t>
+            </w:r>
+          </w:p>
+        </w:tc>
+      </w:tr>
+      <w:tr>
+        <w:tc>
+          <w:tcPr>
+            <w:tcW w:type="dxa" w:w="648"/>
+          </w:tcPr>
+          <w:p>
+            <w:r>
+              <w:t>11</w:t>
+            </w:r>
+          </w:p>
+        </w:tc>
+        <w:tc>
+          <w:tcPr>
+            <w:tcW w:type="dxa" w:w="648"/>
+          </w:tcPr>
+          <w:p>
+            <w:r>
+              <w:t>C</w:t>
+            </w:r>
+          </w:p>
+        </w:tc>
+        <w:tc>
+          <w:tcPr>
+            <w:tcW w:type="dxa" w:w="4608"/>
+          </w:tcPr>
+          <w:p>
+            <w:r>
+              <w:t>Documentation writing — Markdown YAML frontmatter</w:t>
+            </w:r>
+          </w:p>
+        </w:tc>
+        <w:tc>
+          <w:tcPr>
+            <w:tcW w:type="dxa" w:w="3024"/>
+          </w:tcPr>
+          <w:p>
+            <w:r>
+              <w:t>P3 first introduction</w:t>
+            </w:r>
+          </w:p>
+        </w:tc>
+      </w:tr>
+      <w:tr>
+        <w:tc>
+          <w:tcPr>
+            <w:tcW w:type="dxa" w:w="648"/>
+          </w:tcPr>
+          <w:p>
+            <w:r>
+              <w:t>12</w:t>
+            </w:r>
+          </w:p>
+        </w:tc>
+        <w:tc>
+          <w:tcPr>
+            <w:tcW w:type="dxa" w:w="648"/>
+          </w:tcPr>
+          <w:p>
+            <w:r>
+              <w:t>C</w:t>
+            </w:r>
+          </w:p>
+        </w:tc>
+        <w:tc>
+          <w:tcPr>
+            <w:tcW w:type="dxa" w:w="4608"/>
+          </w:tcPr>
+          <w:p>
+            <w:r>
+              <w:t>Data processing — JSON meta object application</w:t>
+            </w:r>
+          </w:p>
+        </w:tc>
+        <w:tc>
+          <w:tcPr>
+            <w:tcW w:type="dxa" w:w="3024"/>
+          </w:tcPr>
+          <w:p>
+            <w:r>
+              <w:t>P3 JSON variant</w:t>
+            </w:r>
+          </w:p>
+        </w:tc>
+      </w:tr>
+      <w:tr>
+        <w:tc>
+          <w:tcPr>
+            <w:tcW w:type="dxa" w:w="648"/>
+          </w:tcPr>
+          <w:p>
+            <w:r>
+              <w:t>13</w:t>
+            </w:r>
+          </w:p>
+        </w:tc>
+        <w:tc>
+          <w:tcPr>
+            <w:tcW w:type="dxa" w:w="648"/>
+          </w:tcPr>
+          <w:p>
+            <w:r>
+              <w:t>C</w:t>
+            </w:r>
+          </w:p>
+        </w:tc>
+        <w:tc>
+          <w:tcPr>
+            <w:tcW w:type="dxa" w:w="4608"/>
+          </w:tcPr>
+          <w:p>
+            <w:r>
+              <w:t>Code engineering — Python module docstring Meta</w:t>
+            </w:r>
+          </w:p>
+        </w:tc>
+        <w:tc>
+          <w:tcPr>
+            <w:tcW w:type="dxa" w:w="3024"/>
+          </w:tcPr>
+          <w:p>
+            <w:r>
+              <w:t>P3 Python variant</w:t>
+            </w:r>
+          </w:p>
+        </w:tc>
+      </w:tr>
+      <w:tr>
+        <w:tc>
+          <w:tcPr>
+            <w:tcW w:type="dxa" w:w="648"/>
+          </w:tcPr>
+          <w:p>
+            <w:r>
+              <w:t>14</w:t>
+            </w:r>
+          </w:p>
+        </w:tc>
+        <w:tc>
+          <w:tcPr>
+            <w:tcW w:type="dxa" w:w="648"/>
+          </w:tcPr>
+          <w:p>
+            <w:r>
+              <w:t>C</w:t>
+            </w:r>
+          </w:p>
+        </w:tc>
+        <w:tc>
+          <w:tcPr>
+            <w:tcW w:type="dxa" w:w="4608"/>
+          </w:tcPr>
+          <w:p>
+            <w:r>
+              <w:t>Project management — P1 + P2 + P3 combined</w:t>
+            </w:r>
+          </w:p>
+        </w:tc>
+        <w:tc>
+          <w:tcPr>
+            <w:tcW w:type="dxa" w:w="3024"/>
+          </w:tcPr>
+          <w:p>
+            <w:r>
+              <w:t>Three-rule validation</w:t>
+            </w:r>
+          </w:p>
+        </w:tc>
+      </w:tr>
+      <w:tr>
+        <w:tc>
+          <w:tcPr>
+            <w:tcW w:type="dxa" w:w="648"/>
+          </w:tcPr>
+          <w:p>
+            <w:r>
+              <w:t>15</w:t>
+            </w:r>
+          </w:p>
+        </w:tc>
+        <w:tc>
+          <w:tcPr>
+            <w:tcW w:type="dxa" w:w="648"/>
+          </w:tcPr>
+          <w:p>
+            <w:r>
+              <w:t>C</w:t>
+            </w:r>
+          </w:p>
+        </w:tc>
+        <w:tc>
+          <w:tcPr>
+            <w:tcW w:type="dxa" w:w="4608"/>
+          </w:tcPr>
+          <w:p>
+            <w:r>
+              <w:t>Comprehensive wrap-up — P3 across all file types</w:t>
+            </w:r>
+          </w:p>
+        </w:tc>
+        <w:tc>
+          <w:tcPr>
+            <w:tcW w:type="dxa" w:w="3024"/>
+          </w:tcPr>
+          <w:p>
+            <w:r>
+              <w:t>P3 full generalization</w:t>
+            </w:r>
+          </w:p>
+        </w:tc>
+      </w:tr>
+      <w:tr>
+        <w:tc>
+          <w:tcPr>
+            <w:tcW w:type="dxa" w:w="648"/>
+          </w:tcPr>
+          <w:p>
+            <w:r>
+              <w:t>16</w:t>
+            </w:r>
+          </w:p>
+        </w:tc>
+        <w:tc>
+          <w:tcPr>
+            <w:tcW w:type="dxa" w:w="648"/>
+          </w:tcPr>
+          <w:p>
+            <w:r>
+              <w:t>D</w:t>
+            </w:r>
+          </w:p>
+        </w:tc>
+        <w:tc>
+          <w:tcPr>
+            <w:tcW w:type="dxa" w:w="4608"/>
+          </w:tcPr>
+          <w:p>
+            <w:r>
+              <w:t>Documentation writing — P4 backup first introduction</w:t>
+            </w:r>
+          </w:p>
+        </w:tc>
+        <w:tc>
+          <w:tcPr>
+            <w:tcW w:type="dxa" w:w="3024"/>
+          </w:tcPr>
+          <w:p>
+            <w:r>
+              <w:t>P4 first introduction</w:t>
+            </w:r>
+          </w:p>
+        </w:tc>
+      </w:tr>
+      <w:tr>
+        <w:tc>
+          <w:tcPr>
+            <w:tcW w:type="dxa" w:w="648"/>
+          </w:tcPr>
+          <w:p>
+            <w:r>
+              <w:t>17</w:t>
+            </w:r>
+          </w:p>
+        </w:tc>
+        <w:tc>
+          <w:tcPr>
+            <w:tcW w:type="dxa" w:w="648"/>
+          </w:tcPr>
+          <w:p>
+            <w:r>
+              <w:t>D</w:t>
+            </w:r>
+          </w:p>
+        </w:tc>
+        <w:tc>
+          <w:tcPr>
+            <w:tcW w:type="dxa" w:w="4608"/>
+          </w:tcPr>
+          <w:p>
+            <w:r>
+              <w:t>Data processing — P4 backup for data files</w:t>
+            </w:r>
+          </w:p>
+        </w:tc>
+        <w:tc>
+          <w:tcPr>
+            <w:tcW w:type="dxa" w:w="3024"/>
+          </w:tcPr>
+          <w:p>
+            <w:r>
+              <w:t>P4 consolidation</w:t>
+            </w:r>
+          </w:p>
+        </w:tc>
+      </w:tr>
+      <w:tr>
+        <w:tc>
+          <w:tcPr>
+            <w:tcW w:type="dxa" w:w="648"/>
+          </w:tcPr>
+          <w:p>
+            <w:r>
+              <w:t>18</w:t>
+            </w:r>
+          </w:p>
+        </w:tc>
+        <w:tc>
+          <w:tcPr>
+            <w:tcW w:type="dxa" w:w="648"/>
+          </w:tcPr>
+          <w:p>
+            <w:r>
+              <w:t>D</w:t>
+            </w:r>
+          </w:p>
+        </w:tc>
+        <w:tc>
+          <w:tcPr>
+            <w:tcW w:type="dxa" w:w="4608"/>
+          </w:tcPr>
+          <w:p>
+            <w:r>
+              <w:t>Code engineering — P4 backup for all file types</w:t>
+            </w:r>
+          </w:p>
+        </w:tc>
+        <w:tc>
+          <w:tcPr>
+            <w:tcW w:type="dxa" w:w="3024"/>
+          </w:tcPr>
+          <w:p>
+            <w:r>
+              <w:t>P4 cross-domain transfer</w:t>
+            </w:r>
+          </w:p>
+        </w:tc>
+      </w:tr>
+      <w:tr>
+        <w:tc>
+          <w:tcPr>
+            <w:tcW w:type="dxa" w:w="648"/>
+          </w:tcPr>
+          <w:p>
+            <w:r>
+              <w:t>19</w:t>
+            </w:r>
+          </w:p>
+        </w:tc>
+        <w:tc>
+          <w:tcPr>
+            <w:tcW w:type="dxa" w:w="648"/>
+          </w:tcPr>
+          <w:p>
+            <w:r>
+              <w:t>D</w:t>
+            </w:r>
+          </w:p>
+        </w:tc>
+        <w:tc>
+          <w:tcPr>
+            <w:tcW w:type="dxa" w:w="4608"/>
+          </w:tcPr>
+          <w:p>
+            <w:r>
+              <w:t>Project management — P1 + P2 + P4 combined</w:t>
+            </w:r>
+          </w:p>
+        </w:tc>
+        <w:tc>
+          <w:tcPr>
+            <w:tcW w:type="dxa" w:w="3024"/>
+          </w:tcPr>
+          <w:p>
+            <w:r>
+              <w:t>Four-rule validation</w:t>
+            </w:r>
+          </w:p>
+        </w:tc>
+      </w:tr>
+      <w:tr>
+        <w:tc>
+          <w:tcPr>
+            <w:tcW w:type="dxa" w:w="648"/>
+          </w:tcPr>
+          <w:p>
+            <w:r>
+              <w:t>20</w:t>
+            </w:r>
+          </w:p>
+        </w:tc>
+        <w:tc>
+          <w:tcPr>
+            <w:tcW w:type="dxa" w:w="648"/>
+          </w:tcPr>
+          <w:p>
+            <w:r>
+              <w:t>D</w:t>
+            </w:r>
+          </w:p>
+        </w:tc>
+        <w:tc>
+          <w:tcPr>
+            <w:tcW w:type="dxa" w:w="4608"/>
+          </w:tcPr>
+          <w:p>
+            <w:r>
+              <w:t>Comprehensive wrap-up — P4 full generalization</w:t>
+            </w:r>
+          </w:p>
+        </w:tc>
+        <w:tc>
+          <w:tcPr>
+            <w:tcW w:type="dxa" w:w="3024"/>
+          </w:tcPr>
+          <w:p>
+            <w:r>
+              <w:t>P4 full generalization</w:t>
+            </w:r>
+          </w:p>
+        </w:tc>
+      </w:tr>
+      <w:tr>
+        <w:tc>
+          <w:tcPr>
+            <w:tcW w:type="dxa" w:w="648"/>
+          </w:tcPr>
+          <w:p>
+            <w:r>
+              <w:t>21</w:t>
+            </w:r>
+          </w:p>
+        </w:tc>
+        <w:tc>
+          <w:tcPr>
+            <w:tcW w:type="dxa" w:w="648"/>
+          </w:tcPr>
+          <w:p>
+            <w:r>
+              <w:t>E</w:t>
+            </w:r>
+          </w:p>
+        </w:tc>
+        <w:tc>
+          <w:tcPr>
+            <w:tcW w:type="dxa" w:w="4608"/>
+          </w:tcPr>
+          <w:p>
+            <w:r>
+              <w:t>Documentation writing — P5 done.log introduction</w:t>
+            </w:r>
+          </w:p>
+        </w:tc>
+        <w:tc>
+          <w:tcPr>
+            <w:tcW w:type="dxa" w:w="3024"/>
+          </w:tcPr>
+          <w:p>
+            <w:r>
+              <w:t>P5 first introduction</w:t>
+            </w:r>
+          </w:p>
+        </w:tc>
+      </w:tr>
+      <w:tr>
+        <w:tc>
+          <w:tcPr>
+            <w:tcW w:type="dxa" w:w="648"/>
+          </w:tcPr>
+          <w:p>
+            <w:r>
+              <w:t>22</w:t>
+            </w:r>
+          </w:p>
+        </w:tc>
+        <w:tc>
+          <w:tcPr>
+            <w:tcW w:type="dxa" w:w="648"/>
+          </w:tcPr>
+          <w:p>
+            <w:r>
+              <w:t>E</w:t>
+            </w:r>
+          </w:p>
+        </w:tc>
+        <w:tc>
+          <w:tcPr>
+            <w:tcW w:type="dxa" w:w="4608"/>
+          </w:tcPr>
+          <w:p>
+            <w:r>
+              <w:t>Project management — P5 append-not-overwrite</w:t>
+            </w:r>
+          </w:p>
+        </w:tc>
+        <w:tc>
+          <w:tcPr>
+            <w:tcW w:type="dxa" w:w="3024"/>
+          </w:tcPr>
+          <w:p>
+            <w:r>
+              <w:t>P5 + P1 + P2 combined</w:t>
+            </w:r>
+          </w:p>
+        </w:tc>
+      </w:tr>
+      <w:tr>
+        <w:tc>
+          <w:tcPr>
+            <w:tcW w:type="dxa" w:w="648"/>
+          </w:tcPr>
+          <w:p>
+            <w:r>
+              <w:t>23</w:t>
+            </w:r>
+          </w:p>
+        </w:tc>
+        <w:tc>
+          <w:tcPr>
+            <w:tcW w:type="dxa" w:w="648"/>
+          </w:tcPr>
+          <w:p>
+            <w:r>
+              <w:t>E</w:t>
+            </w:r>
+          </w:p>
+        </w:tc>
+        <w:tc>
+          <w:tcPr>
+            <w:tcW w:type="dxa" w:w="4608"/>
+          </w:tcPr>
+          <w:p>
+            <w:r>
+              <w:t>Data processing — P5 cross-domain generalization</w:t>
+            </w:r>
+          </w:p>
+        </w:tc>
+        <w:tc>
+          <w:tcPr>
+            <w:tcW w:type="dxa" w:w="3024"/>
+          </w:tcPr>
+          <w:p>
+            <w:r>
+              <w:t>P5 transfer</w:t>
+            </w:r>
+          </w:p>
+        </w:tc>
+      </w:tr>
+      <w:tr>
+        <w:tc>
+          <w:tcPr>
+            <w:tcW w:type="dxa" w:w="648"/>
+          </w:tcPr>
+          <w:p>
+            <w:r>
+              <w:t>24</w:t>
+            </w:r>
+          </w:p>
+        </w:tc>
+        <w:tc>
+          <w:tcPr>
+            <w:tcW w:type="dxa" w:w="648"/>
+          </w:tcPr>
+          <w:p>
+            <w:r>
+              <w:t>E</w:t>
+            </w:r>
+          </w:p>
+        </w:tc>
+        <w:tc>
+          <w:tcPr>
+            <w:tcW w:type="dxa" w:w="4608"/>
+          </w:tcPr>
+          <w:p>
+            <w:r>
+              <w:t>Code engineering — P1 + P3 + P5 combined</w:t>
+            </w:r>
+          </w:p>
+        </w:tc>
+        <w:tc>
+          <w:tcPr>
+            <w:tcW w:type="dxa" w:w="3024"/>
+          </w:tcPr>
+          <w:p>
+            <w:r>
+              <w:t>Five-rule synthesis</w:t>
+            </w:r>
+          </w:p>
+        </w:tc>
+      </w:tr>
+      <w:tr>
+        <w:tc>
+          <w:tcPr>
+            <w:tcW w:type="dxa" w:w="648"/>
+          </w:tcPr>
+          <w:p>
+            <w:r>
+              <w:t>25</w:t>
+            </w:r>
+          </w:p>
+        </w:tc>
+        <w:tc>
+          <w:tcPr>
+            <w:tcW w:type="dxa" w:w="648"/>
+          </w:tcPr>
+          <w:p>
+            <w:r>
+              <w:t>E</w:t>
+            </w:r>
+          </w:p>
+        </w:tc>
+        <w:tc>
+          <w:tcPr>
+            <w:tcW w:type="dxa" w:w="4608"/>
+          </w:tcPr>
+          <w:p>
+            <w:r>
+              <w:t>Comprehensive wrap-up — P1–P5 all rules combined</w:t>
+            </w:r>
+          </w:p>
+        </w:tc>
+        <w:tc>
+          <w:tcPr>
+            <w:tcW w:type="dxa" w:w="3024"/>
+          </w:tcPr>
+          <w:p>
+            <w:r>
+              <w:t>Full five-rule test</w:t>
+            </w:r>
+          </w:p>
+        </w:tc>
+      </w:tr>
+      <w:tr>
+        <w:tc>
+          <w:tcPr>
+            <w:tcW w:type="dxa" w:w="648"/>
+          </w:tcPr>
+          <w:p>
+            <w:r>
+              <w:t>26</w:t>
+            </w:r>
+          </w:p>
+        </w:tc>
+        <w:tc>
+          <w:tcPr>
+            <w:tcW w:type="dxa" w:w="648"/>
+          </w:tcPr>
+          <w:p>
+            <w:r>
+              <w:t>F</w:t>
+            </w:r>
+          </w:p>
+        </w:tc>
+        <w:tc>
+          <w:tcPr>
+            <w:tcW w:type="dxa" w:w="4608"/>
+          </w:tcPr>
+          <w:p>
+            <w:r>
+              <w:t>Sprint 10 code engineering — all P1–P5 rules</w:t>
+            </w:r>
+          </w:p>
+        </w:tc>
+        <w:tc>
+          <w:tcPr>
+            <w:tcW w:type="dxa" w:w="3024"/>
+          </w:tcPr>
+          <w:p>
+            <w:r>
+              <w:t>Zero-hint exam (domain 1)</w:t>
+            </w:r>
+          </w:p>
+        </w:tc>
+      </w:tr>
+      <w:tr>
+        <w:tc>
+          <w:tcPr>
+            <w:tcW w:type="dxa" w:w="648"/>
+          </w:tcPr>
+          <w:p>
+            <w:r>
+              <w:t>27</w:t>
+            </w:r>
+          </w:p>
+        </w:tc>
+        <w:tc>
+          <w:tcPr>
+            <w:tcW w:type="dxa" w:w="648"/>
+          </w:tcPr>
+          <w:p>
+            <w:r>
+              <w:t>F</w:t>
+            </w:r>
+          </w:p>
+        </w:tc>
+        <w:tc>
+          <w:tcPr>
+            <w:tcW w:type="dxa" w:w="4608"/>
+          </w:tcPr>
+          <w:p>
+            <w:r>
+              <w:t>Sprint 10 technical documentation — all P1–P5 rules</w:t>
+            </w:r>
+          </w:p>
+        </w:tc>
+        <w:tc>
+          <w:tcPr>
+            <w:tcW w:type="dxa" w:w="3024"/>
+          </w:tcPr>
+          <w:p>
+            <w:r>
+              <w:t>Zero-hint exam (domain 2)</w:t>
+            </w:r>
+          </w:p>
+        </w:tc>
+      </w:tr>
+      <w:tr>
+        <w:tc>
+          <w:tcPr>
+            <w:tcW w:type="dxa" w:w="648"/>
+          </w:tcPr>
+          <w:p>
+            <w:r>
+              <w:t>28</w:t>
+            </w:r>
+          </w:p>
+        </w:tc>
+        <w:tc>
+          <w:tcPr>
+            <w:tcW w:type="dxa" w:w="648"/>
+          </w:tcPr>
+          <w:p>
+            <w:r>
+              <w:t>F</w:t>
+            </w:r>
+          </w:p>
+        </w:tc>
+        <w:tc>
+          <w:tcPr>
+            <w:tcW w:type="dxa" w:w="4608"/>
+          </w:tcPr>
+          <w:p>
+            <w:r>
+              <w:t>Sprint 10 data processing and reporting — all P1–P5</w:t>
+            </w:r>
+          </w:p>
+        </w:tc>
+        <w:tc>
+          <w:tcPr>
+            <w:tcW w:type="dxa" w:w="3024"/>
+          </w:tcPr>
+          <w:p>
+            <w:r>
+              <w:t>Zero-hint exam (domain 3)</w:t>
+            </w:r>
+          </w:p>
+        </w:tc>
+      </w:tr>
+      <w:tr>
+        <w:tc>
+          <w:tcPr>
+            <w:tcW w:type="dxa" w:w="648"/>
+          </w:tcPr>
+          <w:p>
+            <w:r>
+              <w:t>29</w:t>
+            </w:r>
+          </w:p>
+        </w:tc>
+        <w:tc>
+          <w:tcPr>
+            <w:tcW w:type="dxa" w:w="648"/>
+          </w:tcPr>
+          <w:p>
+            <w:r>
+              <w:t>F</w:t>
+            </w:r>
+          </w:p>
+        </w:tc>
+        <w:tc>
+          <w:tcPr>
+            <w:tcW w:type="dxa" w:w="4608"/>
+          </w:tcPr>
+          <w:p>
+            <w:r>
+              <w:t>Sprint 10 project management — all P1–P5 rules</w:t>
+            </w:r>
+          </w:p>
+        </w:tc>
+        <w:tc>
+          <w:tcPr>
+            <w:tcW w:type="dxa" w:w="3024"/>
+          </w:tcPr>
+          <w:p>
+            <w:r>
+              <w:t>Zero-hint exam (domain 4)</w:t>
+            </w:r>
+          </w:p>
+        </w:tc>
+      </w:tr>
+      <w:tr>
+        <w:tc>
+          <w:tcPr>
+            <w:tcW w:type="dxa" w:w="648"/>
+          </w:tcPr>
+          <w:p>
+            <w:r>
+              <w:t>30</w:t>
+            </w:r>
+          </w:p>
+        </w:tc>
+        <w:tc>
+          <w:tcPr>
+            <w:tcW w:type="dxa" w:w="648"/>
+          </w:tcPr>
+          <w:p>
+            <w:r>
+              <w:t>F</w:t>
+            </w:r>
+          </w:p>
+        </w:tc>
+        <w:tc>
+          <w:tcPr>
+            <w:tcW w:type="dxa" w:w="4608"/>
+          </w:tcPr>
+          <w:p>
+            <w:r>
+              <w:t>Sprint 10 final benchmark challenge — all P1–P5 rules</w:t>
+            </w:r>
+          </w:p>
+        </w:tc>
+        <w:tc>
+          <w:tcPr>
+            <w:tcW w:type="dxa" w:w="3024"/>
+          </w:tcPr>
+          <w:p>
+            <w:r>
+              <w:t>Ultimate compliance exam</w:t>
+            </w:r>
+          </w:p>
+        </w:tc>
+      </w:tr>
+    </w:tbl>
+    <w:p/>
     <w:p>
       <w:r>
         <w:rPr>
@@ -757,7 +2126,7 @@
           <w:b w:val="0"/>
           <w:i w:val="0"/>
         </w:rPr>
-        <w:t>Day 02 (Arc A): Switches to a completely different work domain (data processing) and tests P1 again — but this time the feedback does not explain P1. The agent must remember it on its own.</w:t>
+        <w:t>By Day 05 (end of Arc A), the agent has encountered P1 in five completely different work domains (standup notes, milestone reports, API logs, code docs, sprint reviews). Arc B then introduces P2 on top of this foundation, and so on cumulatively through Day 30.</w:t>
       </w:r>
     </w:p>
     <w:p>
@@ -1573,7 +2942,7 @@
           <w:b w:val="0"/>
           <w:i w:val="0"/>
         </w:rPr>
-        <w:t>Arc F (days 11–12 in the small version, days 29–30 in the full version) removes all hint-bearing feedback. The incorrect branch of feedback only identifies what went wrong, not how to fix it. This validates true internalization: the agent must know the rules from memory or weights, not from in-context clues.</w:t>
+        <w:t>Arc F (Days 26–30) removes all hint-bearing feedback. The incorrect branch of feedback only identifies what went wrong, not how to fix it. After 25 days of cumulative feedback exposure, the agent must know all five rules from memory or weights, not from in-context clues. Day 30 ('Sprint 10 final benchmark challenge') is the ultimate exam: all five rules, hardest task complexity, zero guidance.</w:t>
       </w:r>
     </w:p>
     <w:p>
@@ -1718,7 +3087,7 @@
           <w:color w:val="808080"/>
           <w:sz w:val="18"/>
         </w:rPr>
-        <w:t>Source: Analysis of MetaClaw repository at github.com/TinaZhang66/MetaClaw. All code references are from benchmark/src/ and benchmark/data/metaclaw-bench-small/.</w:t>
+        <w:t>Source: Analysis of MetaClaw repository at github.com/TinaZhang66/MetaClaw. All code references are from benchmark/src/ and benchmark/data/metaclaw-bench/.</w:t>
       </w:r>
     </w:p>
     <w:sectPr>

</xml_diff>